<commit_message>
avancement script (scène 4)
</commit_message>
<xml_diff>
--- a/SCRIPT_ENTRE CHIEN ET LOUP.docx
+++ b/SCRIPT_ENTRE CHIEN ET LOUP.docx
@@ -848,7 +848,25 @@
           <w:sz w:val="24"/>
           <w:szCs w:val="24"/>
         </w:rPr>
-        <w:t xml:space="preserve">Blaise, personnage incarné, descends de son bus, arrivé à son terminus, St. Martyrs. Dernières images du jour avant longtemps, Blaise est une voix off, la prise de vue est à la première personne. La est un tutoriel montrant au joueur comment observer et se déplacer de tableau en tableau. Le </w:t>
+        <w:t xml:space="preserve">Blaise, personnage incarné, descends de son bus, arrivé à son terminus, St. Martyrs. Dernières images du jour avant longtemps, Blaise est une voix off, la prise de vue est à la première personne. </w:t>
+      </w:r>
+      <w:proofErr w:type="gramStart"/>
+      <w:r>
+        <w:rPr>
+          <w:rFonts w:ascii="Courier New" w:hAnsi="Courier New" w:cs="Courier New"/>
+          <w:sz w:val="24"/>
+          <w:szCs w:val="24"/>
+        </w:rPr>
+        <w:t>La est</w:t>
+      </w:r>
+      <w:proofErr w:type="gramEnd"/>
+      <w:r>
+        <w:rPr>
+          <w:rFonts w:ascii="Courier New" w:hAnsi="Courier New" w:cs="Courier New"/>
+          <w:sz w:val="24"/>
+          <w:szCs w:val="24"/>
+        </w:rPr>
+        <w:t xml:space="preserve"> un tutoriel montrant au joueur comment observer et se déplacer de tableau en tableau. Le </w:t>
       </w:r>
       <w:r>
         <w:rPr>
@@ -891,73 +909,25 @@
           <w:sz w:val="24"/>
           <w:szCs w:val="24"/>
         </w:rPr>
-        <w:t>SON OFF, ARRÊT VÉHICULE MOTORIS</w:t>
-      </w:r>
-      <w:r>
-        <w:rPr>
-          <w:rFonts w:ascii="Courier New" w:hAnsi="Courier New" w:cs="Courier New"/>
-          <w:sz w:val="24"/>
-          <w:szCs w:val="24"/>
-        </w:rPr>
-        <w:t>É</w:t>
-      </w:r>
-      <w:r>
-        <w:rPr>
-          <w:rFonts w:ascii="Courier New" w:hAnsi="Courier New" w:cs="Courier New"/>
-          <w:sz w:val="24"/>
-          <w:szCs w:val="24"/>
-        </w:rPr>
-        <w:t>.</w:t>
-      </w:r>
-    </w:p>
-    <w:p>
-      <w:pPr>
-        <w:jc w:val="center"/>
-        <w:rPr>
-          <w:rFonts w:ascii="Courier New" w:hAnsi="Courier New" w:cs="Courier New"/>
-          <w:sz w:val="24"/>
-          <w:szCs w:val="24"/>
-        </w:rPr>
-      </w:pPr>
-      <w:r>
-        <w:rPr>
-          <w:rFonts w:ascii="Courier New" w:hAnsi="Courier New" w:cs="Courier New"/>
-          <w:sz w:val="24"/>
-          <w:szCs w:val="24"/>
-        </w:rPr>
-        <w:t>SON OFF</w:t>
-      </w:r>
-      <w:r>
-        <w:rPr>
-          <w:rFonts w:ascii="Courier New" w:hAnsi="Courier New" w:cs="Courier New"/>
-          <w:sz w:val="24"/>
-          <w:szCs w:val="24"/>
-        </w:rPr>
-        <w:t xml:space="preserve"> CONTINUE</w:t>
-      </w:r>
-      <w:r>
-        <w:rPr>
-          <w:rFonts w:ascii="Courier New" w:hAnsi="Courier New" w:cs="Courier New"/>
-          <w:sz w:val="24"/>
-          <w:szCs w:val="24"/>
-        </w:rPr>
-        <w:t>,</w:t>
-      </w:r>
-      <w:r>
-        <w:rPr>
-          <w:rFonts w:ascii="Courier New" w:hAnsi="Courier New" w:cs="Courier New"/>
-          <w:sz w:val="24"/>
-          <w:szCs w:val="24"/>
-        </w:rPr>
-        <w:t xml:space="preserve"> MOTEUR DE BUS</w:t>
-      </w:r>
-      <w:r>
-        <w:rPr>
-          <w:rFonts w:ascii="Courier New" w:hAnsi="Courier New" w:cs="Courier New"/>
-          <w:sz w:val="24"/>
-          <w:szCs w:val="24"/>
-        </w:rPr>
-        <w:t>.</w:t>
+        <w:t>SON OFF, ARRÊT VÉHICULE MOTORISÉ.</w:t>
+      </w:r>
+    </w:p>
+    <w:p>
+      <w:pPr>
+        <w:jc w:val="center"/>
+        <w:rPr>
+          <w:rFonts w:ascii="Courier New" w:hAnsi="Courier New" w:cs="Courier New"/>
+          <w:sz w:val="24"/>
+          <w:szCs w:val="24"/>
+        </w:rPr>
+      </w:pPr>
+      <w:r>
+        <w:rPr>
+          <w:rFonts w:ascii="Courier New" w:hAnsi="Courier New" w:cs="Courier New"/>
+          <w:sz w:val="24"/>
+          <w:szCs w:val="24"/>
+        </w:rPr>
+        <w:t>SON OFF CONTINUE, MOTEUR DE BUS.</w:t>
       </w:r>
     </w:p>
     <w:p>
@@ -1074,54 +1044,24 @@
           <w:sz w:val="24"/>
           <w:szCs w:val="24"/>
         </w:rPr>
-        <w:t xml:space="preserve">AFFICHAGE TITRE, </w:t>
-      </w:r>
-      <w:r>
-        <w:rPr>
-          <w:rFonts w:ascii="Courier New" w:hAnsi="Courier New" w:cs="Courier New"/>
-          <w:sz w:val="24"/>
-          <w:szCs w:val="24"/>
-        </w:rPr>
-        <w:t>É</w:t>
-      </w:r>
-      <w:r>
-        <w:rPr>
-          <w:rFonts w:ascii="Courier New" w:hAnsi="Courier New" w:cs="Courier New"/>
-          <w:sz w:val="24"/>
-          <w:szCs w:val="24"/>
-        </w:rPr>
-        <w:t>CRAN PLEINEMENT OCCUP</w:t>
-      </w:r>
-      <w:r>
-        <w:rPr>
-          <w:rFonts w:ascii="Courier New" w:hAnsi="Courier New" w:cs="Courier New"/>
-          <w:sz w:val="24"/>
-          <w:szCs w:val="24"/>
-        </w:rPr>
-        <w:t>É</w:t>
-      </w:r>
-      <w:r>
-        <w:rPr>
-          <w:rFonts w:ascii="Courier New" w:hAnsi="Courier New" w:cs="Courier New"/>
-          <w:sz w:val="24"/>
-          <w:szCs w:val="24"/>
-        </w:rPr>
-        <w:t>.</w:t>
-      </w:r>
-    </w:p>
-    <w:p>
-      <w:pPr>
-        <w:rPr>
-          <w:rFonts w:ascii="Courier New" w:hAnsi="Courier New" w:cs="Courier New"/>
-          <w:sz w:val="24"/>
-          <w:szCs w:val="24"/>
-        </w:rPr>
-      </w:pPr>
-      <w:r>
-        <w:rPr>
-          <w:rFonts w:ascii="Courier New" w:hAnsi="Courier New" w:cs="Courier New"/>
-          <w:sz w:val="24"/>
-          <w:szCs w:val="24"/>
+        <w:t>AFFICHAGE TITRE, ÉCRAN PLEINEMENT OCCUPÉ.</w:t>
+      </w:r>
+    </w:p>
+    <w:p>
+      <w:pPr>
+        <w:rPr>
+          <w:rFonts w:ascii="Courier New" w:hAnsi="Courier New" w:cs="Courier New"/>
+          <w:sz w:val="24"/>
+          <w:szCs w:val="24"/>
+          <w:lang w:val="en-GB"/>
+        </w:rPr>
+      </w:pPr>
+      <w:r>
+        <w:rPr>
+          <w:rFonts w:ascii="Courier New" w:hAnsi="Courier New" w:cs="Courier New"/>
+          <w:sz w:val="24"/>
+          <w:szCs w:val="24"/>
+          <w:lang w:val="en-GB"/>
         </w:rPr>
         <w:t>CUT, PARKING 1.</w:t>
       </w:r>
@@ -1133,13 +1073,15 @@
           <w:rFonts w:ascii="Courier New" w:hAnsi="Courier New" w:cs="Courier New"/>
           <w:sz w:val="24"/>
           <w:szCs w:val="24"/>
-        </w:rPr>
-      </w:pPr>
-      <w:r>
-        <w:rPr>
-          <w:rFonts w:ascii="Courier New" w:hAnsi="Courier New" w:cs="Courier New"/>
-          <w:sz w:val="24"/>
-          <w:szCs w:val="24"/>
+          <w:lang w:val="en-GB"/>
+        </w:rPr>
+      </w:pPr>
+      <w:r>
+        <w:rPr>
+          <w:rFonts w:ascii="Courier New" w:hAnsi="Courier New" w:cs="Courier New"/>
+          <w:sz w:val="24"/>
+          <w:szCs w:val="24"/>
+          <w:lang w:val="en-GB"/>
         </w:rPr>
         <w:tab/>
         <w:t>ARRÊT SONS OFF.</w:t>
@@ -1212,15 +1154,7 @@
           <w:sz w:val="24"/>
           <w:szCs w:val="24"/>
         </w:rPr>
-        <w:t>ÉCRAN NOIR.</w:t>
-      </w:r>
-      <w:r>
-        <w:rPr>
-          <w:rFonts w:ascii="Courier New" w:hAnsi="Courier New" w:cs="Courier New"/>
-          <w:sz w:val="24"/>
-          <w:szCs w:val="24"/>
-        </w:rPr>
-        <w:t xml:space="preserve"> SAUVEGARDE.</w:t>
+        <w:t>ÉCRAN NOIR. SAUVEGARDE.</w:t>
       </w:r>
       <w:r>
         <w:rPr>
@@ -1322,23 +1256,7 @@
           <w:sz w:val="24"/>
           <w:szCs w:val="24"/>
         </w:rPr>
-        <w:t>INT</w:t>
-      </w:r>
-      <w:r>
-        <w:rPr>
-          <w:rFonts w:ascii="Courier New" w:hAnsi="Courier New" w:cs="Courier New"/>
-          <w:sz w:val="24"/>
-          <w:szCs w:val="24"/>
-        </w:rPr>
-        <w:t>É</w:t>
-      </w:r>
-      <w:r>
-        <w:rPr>
-          <w:rFonts w:ascii="Courier New" w:hAnsi="Courier New" w:cs="Courier New"/>
-          <w:sz w:val="24"/>
-          <w:szCs w:val="24"/>
-        </w:rPr>
-        <w:t xml:space="preserve">RIEUR : </w:t>
+        <w:t xml:space="preserve">INTÉRIEUR : </w:t>
       </w:r>
       <w:r>
         <w:rPr>
@@ -2030,7 +1948,15 @@
           <w:sz w:val="24"/>
           <w:szCs w:val="24"/>
         </w:rPr>
-        <w:t>, ton collègue et ton ami, tutoie moi</w:t>
+        <w:t xml:space="preserve">, ton collègue et ton ami, </w:t>
+      </w:r>
+      <w:r>
+        <w:rPr>
+          <w:rFonts w:ascii="Courier New" w:hAnsi="Courier New" w:cs="Courier New"/>
+          <w:sz w:val="24"/>
+          <w:szCs w:val="24"/>
+        </w:rPr>
+        <w:t>tutoie-moi</w:t>
       </w:r>
       <w:r>
         <w:rPr>
@@ -2296,23 +2222,7 @@
           <w:sz w:val="24"/>
           <w:szCs w:val="24"/>
         </w:rPr>
-        <w:t>UI/INT</w:t>
-      </w:r>
-      <w:r>
-        <w:rPr>
-          <w:rFonts w:ascii="Courier New" w:hAnsi="Courier New" w:cs="Courier New"/>
-          <w:sz w:val="24"/>
-          <w:szCs w:val="24"/>
-        </w:rPr>
-        <w:t>É</w:t>
-      </w:r>
-      <w:r>
-        <w:rPr>
-          <w:rFonts w:ascii="Courier New" w:hAnsi="Courier New" w:cs="Courier New"/>
-          <w:sz w:val="24"/>
-          <w:szCs w:val="24"/>
-        </w:rPr>
-        <w:t>RIEUR : bureau Blaise.</w:t>
+        <w:t>UI/INTÉRIEUR : bureau Blaise.</w:t>
       </w:r>
     </w:p>
     <w:p>
@@ -2381,6 +2291,699 @@
           <w:szCs w:val="24"/>
         </w:rPr>
         <w:t>Tutoriel enseignant au joueur les différentes fonctions de la carte. Didier aide la première enquête.</w:t>
+      </w:r>
+    </w:p>
+    <w:p>
+      <w:pPr>
+        <w:jc w:val="center"/>
+        <w:rPr>
+          <w:rFonts w:ascii="Courier New" w:hAnsi="Courier New" w:cs="Courier New"/>
+          <w:sz w:val="24"/>
+          <w:szCs w:val="24"/>
+        </w:rPr>
+      </w:pPr>
+      <w:r>
+        <w:rPr>
+          <w:rFonts w:ascii="Courier New" w:hAnsi="Courier New" w:cs="Courier New"/>
+          <w:sz w:val="24"/>
+          <w:szCs w:val="24"/>
+        </w:rPr>
+        <w:t>DIDIER</w:t>
+      </w:r>
+    </w:p>
+    <w:p>
+      <w:pPr>
+        <w:ind w:left="708"/>
+        <w:rPr>
+          <w:rFonts w:ascii="Courier New" w:hAnsi="Courier New" w:cs="Courier New"/>
+          <w:sz w:val="24"/>
+          <w:szCs w:val="24"/>
+        </w:rPr>
+      </w:pPr>
+      <w:r>
+        <w:rPr>
+          <w:rFonts w:ascii="Courier New" w:hAnsi="Courier New" w:cs="Courier New"/>
+          <w:sz w:val="24"/>
+          <w:szCs w:val="24"/>
+        </w:rPr>
+        <w:t xml:space="preserve">Voici ton plan de travail, tu reconnais </w:t>
+      </w:r>
+      <w:r>
+        <w:rPr>
+          <w:rFonts w:ascii="Courier New" w:hAnsi="Courier New" w:cs="Courier New"/>
+          <w:sz w:val="24"/>
+          <w:szCs w:val="24"/>
+        </w:rPr>
+        <w:t>peut-être</w:t>
+      </w:r>
+      <w:r>
+        <w:rPr>
+          <w:rFonts w:ascii="Courier New" w:hAnsi="Courier New" w:cs="Courier New"/>
+          <w:sz w:val="24"/>
+          <w:szCs w:val="24"/>
+        </w:rPr>
+        <w:t xml:space="preserve"> pas le coin mais c’est une fidèle</w:t>
+      </w:r>
+      <w:r>
+        <w:rPr>
+          <w:rFonts w:ascii="Courier New" w:hAnsi="Courier New" w:cs="Courier New"/>
+          <w:sz w:val="24"/>
+          <w:szCs w:val="24"/>
+        </w:rPr>
+        <w:t xml:space="preserve"> reproduction</w:t>
+      </w:r>
+      <w:r>
+        <w:rPr>
+          <w:rFonts w:ascii="Courier New" w:hAnsi="Courier New" w:cs="Courier New"/>
+          <w:sz w:val="24"/>
+          <w:szCs w:val="24"/>
+        </w:rPr>
+        <w:t xml:space="preserve"> de Saints-Martyrs.</w:t>
+      </w:r>
+    </w:p>
+    <w:p>
+      <w:pPr>
+        <w:jc w:val="both"/>
+        <w:rPr>
+          <w:rFonts w:ascii="Courier New" w:hAnsi="Courier New" w:cs="Courier New"/>
+          <w:sz w:val="24"/>
+          <w:szCs w:val="24"/>
+        </w:rPr>
+      </w:pPr>
+      <w:r>
+        <w:rPr>
+          <w:rFonts w:ascii="Courier New" w:hAnsi="Courier New" w:cs="Courier New"/>
+          <w:sz w:val="24"/>
+          <w:szCs w:val="24"/>
+        </w:rPr>
+        <w:t>MISE EN AVANT DU SEUL CRIME SUR LA CARTE</w:t>
+      </w:r>
+    </w:p>
+    <w:p>
+      <w:pPr>
+        <w:jc w:val="center"/>
+        <w:rPr>
+          <w:rFonts w:ascii="Courier New" w:hAnsi="Courier New" w:cs="Courier New"/>
+          <w:sz w:val="24"/>
+          <w:szCs w:val="24"/>
+        </w:rPr>
+      </w:pPr>
+      <w:r>
+        <w:rPr>
+          <w:rFonts w:ascii="Courier New" w:hAnsi="Courier New" w:cs="Courier New"/>
+          <w:sz w:val="24"/>
+          <w:szCs w:val="24"/>
+        </w:rPr>
+        <w:t>DIDIER</w:t>
+      </w:r>
+    </w:p>
+    <w:p>
+      <w:pPr>
+        <w:ind w:left="708"/>
+        <w:jc w:val="both"/>
+        <w:rPr>
+          <w:rFonts w:ascii="Courier New" w:hAnsi="Courier New" w:cs="Courier New"/>
+          <w:sz w:val="24"/>
+          <w:szCs w:val="24"/>
+        </w:rPr>
+      </w:pPr>
+      <w:r>
+        <w:rPr>
+          <w:rFonts w:ascii="Courier New" w:hAnsi="Courier New" w:cs="Courier New"/>
+          <w:sz w:val="24"/>
+          <w:szCs w:val="24"/>
+        </w:rPr>
+        <w:t>Cette punaise là, elle représente un crime lié à une affaire encore non résolue. Toi, ton rôle, c’est d’empêcher le malfaiteur de continuer à perturber l’ordre public.</w:t>
+      </w:r>
+    </w:p>
+    <w:p>
+      <w:pPr>
+        <w:ind w:firstLine="708"/>
+        <w:rPr>
+          <w:rFonts w:ascii="Courier New" w:hAnsi="Courier New" w:cs="Courier New"/>
+          <w:sz w:val="24"/>
+          <w:szCs w:val="24"/>
+        </w:rPr>
+      </w:pPr>
+      <w:r>
+        <w:rPr>
+          <w:rFonts w:ascii="Courier New" w:hAnsi="Courier New" w:cs="Courier New"/>
+          <w:sz w:val="24"/>
+          <w:szCs w:val="24"/>
+        </w:rPr>
+        <w:t xml:space="preserve">Tu as accès à </w:t>
+      </w:r>
+      <w:r>
+        <w:rPr>
+          <w:rFonts w:ascii="Courier New" w:hAnsi="Courier New" w:cs="Courier New"/>
+          <w:sz w:val="24"/>
+          <w:szCs w:val="24"/>
+        </w:rPr>
+        <w:t>toutes nos informations</w:t>
+      </w:r>
+      <w:r>
+        <w:rPr>
+          <w:rFonts w:ascii="Courier New" w:hAnsi="Courier New" w:cs="Courier New"/>
+          <w:sz w:val="24"/>
+          <w:szCs w:val="24"/>
+        </w:rPr>
+        <w:t>.</w:t>
+      </w:r>
+    </w:p>
+    <w:p>
+      <w:pPr>
+        <w:jc w:val="center"/>
+        <w:rPr>
+          <w:rFonts w:ascii="Courier New" w:hAnsi="Courier New" w:cs="Courier New"/>
+          <w:sz w:val="24"/>
+          <w:szCs w:val="24"/>
+        </w:rPr>
+      </w:pPr>
+      <w:r>
+        <w:rPr>
+          <w:rFonts w:ascii="Courier New" w:hAnsi="Courier New" w:cs="Courier New"/>
+          <w:sz w:val="24"/>
+          <w:szCs w:val="24"/>
+        </w:rPr>
+        <w:t>NOTIFICATION</w:t>
+      </w:r>
+    </w:p>
+    <w:p>
+      <w:pPr>
+        <w:ind w:firstLine="708"/>
+        <w:jc w:val="both"/>
+        <w:rPr>
+          <w:rFonts w:ascii="Courier New" w:hAnsi="Courier New" w:cs="Courier New"/>
+          <w:sz w:val="24"/>
+          <w:szCs w:val="24"/>
+        </w:rPr>
+      </w:pPr>
+      <w:r>
+        <w:rPr>
+          <w:rFonts w:ascii="Courier New" w:hAnsi="Courier New" w:cs="Courier New"/>
+          <w:sz w:val="24"/>
+          <w:szCs w:val="24"/>
+        </w:rPr>
+        <w:t>Cliquer sur un crime pour en voir les détails.</w:t>
+      </w:r>
+    </w:p>
+    <w:p>
+      <w:pPr>
+        <w:jc w:val="both"/>
+        <w:rPr>
+          <w:rFonts w:ascii="Courier New" w:hAnsi="Courier New" w:cs="Courier New"/>
+          <w:sz w:val="24"/>
+          <w:szCs w:val="24"/>
+        </w:rPr>
+      </w:pPr>
+      <w:r>
+        <w:rPr>
+          <w:rFonts w:ascii="Courier New" w:hAnsi="Courier New" w:cs="Courier New"/>
+          <w:sz w:val="24"/>
+          <w:szCs w:val="24"/>
+        </w:rPr>
+        <w:t>UNE FEUILLE RENTRE DANS LE CHAMPS ET CONTIENT LES D</w:t>
+      </w:r>
+      <w:r>
+        <w:rPr>
+          <w:rFonts w:ascii="Courier New" w:hAnsi="Courier New" w:cs="Courier New"/>
+          <w:sz w:val="24"/>
+          <w:szCs w:val="24"/>
+        </w:rPr>
+        <w:t>E</w:t>
+      </w:r>
+      <w:r>
+        <w:rPr>
+          <w:rFonts w:ascii="Courier New" w:hAnsi="Courier New" w:cs="Courier New"/>
+          <w:sz w:val="24"/>
+          <w:szCs w:val="24"/>
+        </w:rPr>
+        <w:t>TAILS ET INDICES LI</w:t>
+      </w:r>
+      <w:r>
+        <w:rPr>
+          <w:rFonts w:ascii="Courier New" w:hAnsi="Courier New" w:cs="Courier New"/>
+          <w:sz w:val="24"/>
+          <w:szCs w:val="24"/>
+        </w:rPr>
+        <w:t>E</w:t>
+      </w:r>
+      <w:r>
+        <w:rPr>
+          <w:rFonts w:ascii="Courier New" w:hAnsi="Courier New" w:cs="Courier New"/>
+          <w:sz w:val="24"/>
+          <w:szCs w:val="24"/>
+        </w:rPr>
+        <w:t>S AU CRIME.</w:t>
+      </w:r>
+    </w:p>
+    <w:p>
+      <w:pPr>
+        <w:jc w:val="center"/>
+        <w:rPr>
+          <w:rFonts w:ascii="Courier New" w:hAnsi="Courier New" w:cs="Courier New"/>
+          <w:sz w:val="24"/>
+          <w:szCs w:val="24"/>
+        </w:rPr>
+      </w:pPr>
+      <w:r>
+        <w:rPr>
+          <w:rFonts w:ascii="Courier New" w:hAnsi="Courier New" w:cs="Courier New"/>
+          <w:sz w:val="24"/>
+          <w:szCs w:val="24"/>
+        </w:rPr>
+        <w:t>DIDIER</w:t>
+      </w:r>
+    </w:p>
+    <w:p>
+      <w:pPr>
+        <w:ind w:left="708"/>
+        <w:jc w:val="both"/>
+        <w:rPr>
+          <w:rFonts w:ascii="Courier New" w:hAnsi="Courier New" w:cs="Courier New"/>
+          <w:sz w:val="24"/>
+          <w:szCs w:val="24"/>
+        </w:rPr>
+      </w:pPr>
+      <w:r>
+        <w:rPr>
+          <w:rFonts w:ascii="Courier New" w:hAnsi="Courier New" w:cs="Courier New"/>
+          <w:sz w:val="24"/>
+          <w:szCs w:val="24"/>
+        </w:rPr>
+        <w:t>Comme tu peux le voir, on sait pas grand-chose, si ce n’est qu’on a trouvé chez la victime son agenda dans lequel il est dit qu’elle attendait un rendez-vous avec un médium… On sait rien de ce gars en revanche…</w:t>
+      </w:r>
+    </w:p>
+    <w:p>
+      <w:pPr>
+        <w:jc w:val="center"/>
+        <w:rPr>
+          <w:rFonts w:ascii="Courier New" w:hAnsi="Courier New" w:cs="Courier New"/>
+          <w:sz w:val="24"/>
+          <w:szCs w:val="24"/>
+        </w:rPr>
+      </w:pPr>
+      <w:r>
+        <w:rPr>
+          <w:rFonts w:ascii="Courier New" w:hAnsi="Courier New" w:cs="Courier New"/>
+          <w:sz w:val="24"/>
+          <w:szCs w:val="24"/>
+        </w:rPr>
+        <w:t>BLAISE</w:t>
+      </w:r>
+    </w:p>
+    <w:p>
+      <w:pPr>
+        <w:ind w:firstLine="708"/>
+        <w:jc w:val="both"/>
+        <w:rPr>
+          <w:rFonts w:ascii="Courier New" w:hAnsi="Courier New" w:cs="Courier New"/>
+          <w:sz w:val="24"/>
+          <w:szCs w:val="24"/>
+        </w:rPr>
+      </w:pPr>
+      <w:r>
+        <w:rPr>
+          <w:rFonts w:ascii="Courier New" w:hAnsi="Courier New" w:cs="Courier New"/>
+          <w:sz w:val="24"/>
+          <w:szCs w:val="24"/>
+        </w:rPr>
+        <w:t>Alors on fait quoi ?</w:t>
+      </w:r>
+    </w:p>
+    <w:p>
+      <w:pPr>
+        <w:jc w:val="center"/>
+        <w:rPr>
+          <w:rFonts w:ascii="Courier New" w:hAnsi="Courier New" w:cs="Courier New"/>
+          <w:sz w:val="24"/>
+          <w:szCs w:val="24"/>
+        </w:rPr>
+      </w:pPr>
+      <w:r>
+        <w:rPr>
+          <w:rFonts w:ascii="Courier New" w:hAnsi="Courier New" w:cs="Courier New"/>
+          <w:sz w:val="24"/>
+          <w:szCs w:val="24"/>
+        </w:rPr>
+        <w:t>DIDIER</w:t>
+      </w:r>
+    </w:p>
+    <w:p>
+      <w:pPr>
+        <w:ind w:firstLine="708"/>
+        <w:rPr>
+          <w:rFonts w:ascii="Courier New" w:hAnsi="Courier New" w:cs="Courier New"/>
+          <w:sz w:val="24"/>
+          <w:szCs w:val="24"/>
+        </w:rPr>
+      </w:pPr>
+      <w:r>
+        <w:rPr>
+          <w:rFonts w:ascii="Courier New" w:hAnsi="Courier New" w:cs="Courier New"/>
+          <w:sz w:val="24"/>
+          <w:szCs w:val="24"/>
+        </w:rPr>
+        <w:t>Alors tu vas aller sur place pour enquêter.</w:t>
+      </w:r>
+    </w:p>
+    <w:p>
+      <w:pPr>
+        <w:jc w:val="both"/>
+        <w:rPr>
+          <w:rFonts w:ascii="Courier New" w:hAnsi="Courier New" w:cs="Courier New"/>
+          <w:sz w:val="24"/>
+          <w:szCs w:val="24"/>
+        </w:rPr>
+      </w:pPr>
+      <w:r>
+        <w:rPr>
+          <w:rFonts w:ascii="Courier New" w:hAnsi="Courier New" w:cs="Courier New"/>
+          <w:sz w:val="24"/>
+          <w:szCs w:val="24"/>
+        </w:rPr>
+        <w:t>MISE EN AVANT BOUTON « VILLE »</w:t>
+      </w:r>
+    </w:p>
+    <w:p>
+      <w:pPr>
+        <w:jc w:val="center"/>
+        <w:rPr>
+          <w:rFonts w:ascii="Courier New" w:hAnsi="Courier New" w:cs="Courier New"/>
+          <w:sz w:val="24"/>
+          <w:szCs w:val="24"/>
+        </w:rPr>
+      </w:pPr>
+      <w:r>
+        <w:rPr>
+          <w:rFonts w:ascii="Courier New" w:hAnsi="Courier New" w:cs="Courier New"/>
+          <w:sz w:val="24"/>
+          <w:szCs w:val="24"/>
+        </w:rPr>
+        <w:lastRenderedPageBreak/>
+        <w:t>NOTIFICATION</w:t>
+      </w:r>
+    </w:p>
+    <w:p>
+      <w:pPr>
+        <w:ind w:firstLine="708"/>
+        <w:jc w:val="both"/>
+        <w:rPr>
+          <w:rFonts w:ascii="Courier New" w:hAnsi="Courier New" w:cs="Courier New"/>
+          <w:sz w:val="24"/>
+          <w:szCs w:val="24"/>
+        </w:rPr>
+      </w:pPr>
+      <w:r>
+        <w:rPr>
+          <w:rFonts w:ascii="Courier New" w:hAnsi="Courier New" w:cs="Courier New"/>
+          <w:sz w:val="24"/>
+          <w:szCs w:val="24"/>
+        </w:rPr>
+        <w:t>Cliquer sur l’icône pour vous rendre en ville.</w:t>
+      </w:r>
+    </w:p>
+    <w:p>
+      <w:pPr>
+        <w:jc w:val="right"/>
+        <w:rPr>
+          <w:rFonts w:ascii="Courier New" w:hAnsi="Courier New" w:cs="Courier New"/>
+          <w:sz w:val="24"/>
+          <w:szCs w:val="24"/>
+        </w:rPr>
+      </w:pPr>
+      <w:r>
+        <w:rPr>
+          <w:rFonts w:ascii="Courier New" w:hAnsi="Courier New" w:cs="Courier New"/>
+          <w:sz w:val="24"/>
+          <w:szCs w:val="24"/>
+        </w:rPr>
+        <w:t>FONDU AU NOIR.</w:t>
+      </w:r>
+    </w:p>
+    <w:p>
+      <w:pPr>
+        <w:rPr>
+          <w:rFonts w:ascii="Courier New" w:hAnsi="Courier New" w:cs="Courier New"/>
+          <w:sz w:val="24"/>
+          <w:szCs w:val="24"/>
+        </w:rPr>
+      </w:pPr>
+      <w:r>
+        <w:rPr>
+          <w:rFonts w:ascii="Courier New" w:hAnsi="Courier New" w:cs="Courier New"/>
+          <w:sz w:val="24"/>
+          <w:szCs w:val="24"/>
+        </w:rPr>
+        <w:br w:type="page"/>
+      </w:r>
+    </w:p>
+    <w:p>
+      <w:pPr>
+        <w:jc w:val="center"/>
+        <w:rPr>
+          <w:rFonts w:ascii="Courier New" w:hAnsi="Courier New" w:cs="Courier New"/>
+          <w:sz w:val="24"/>
+          <w:szCs w:val="24"/>
+        </w:rPr>
+      </w:pPr>
+      <w:r>
+        <w:rPr>
+          <w:rFonts w:ascii="Courier New" w:hAnsi="Courier New" w:cs="Courier New"/>
+          <w:sz w:val="24"/>
+          <w:szCs w:val="24"/>
+        </w:rPr>
+        <w:lastRenderedPageBreak/>
+        <w:t>Scène 5</w:t>
+      </w:r>
+    </w:p>
+    <w:p>
+      <w:pPr>
+        <w:rPr>
+          <w:rFonts w:ascii="Courier New" w:hAnsi="Courier New" w:cs="Courier New"/>
+          <w:sz w:val="24"/>
+          <w:szCs w:val="24"/>
+        </w:rPr>
+      </w:pPr>
+      <w:r>
+        <w:rPr>
+          <w:rFonts w:ascii="Courier New" w:hAnsi="Courier New" w:cs="Courier New"/>
+          <w:sz w:val="24"/>
+          <w:szCs w:val="24"/>
+        </w:rPr>
+        <w:t>CHARGEMENT. SAUVEGARDE.</w:t>
+      </w:r>
+    </w:p>
+    <w:p>
+      <w:pPr>
+        <w:rPr>
+          <w:rFonts w:ascii="Courier New" w:hAnsi="Courier New" w:cs="Courier New"/>
+          <w:sz w:val="24"/>
+          <w:szCs w:val="24"/>
+        </w:rPr>
+      </w:pPr>
+      <w:r>
+        <w:rPr>
+          <w:rFonts w:ascii="Courier New" w:hAnsi="Courier New" w:cs="Courier New"/>
+          <w:sz w:val="24"/>
+          <w:szCs w:val="24"/>
+        </w:rPr>
+        <w:t>FONODU AU NOIR :</w:t>
+      </w:r>
+    </w:p>
+    <w:p>
+      <w:pPr>
+        <w:rPr>
+          <w:rFonts w:ascii="Courier New" w:hAnsi="Courier New" w:cs="Courier New"/>
+          <w:sz w:val="24"/>
+          <w:szCs w:val="24"/>
+        </w:rPr>
+      </w:pPr>
+      <w:r>
+        <w:rPr>
+          <w:rFonts w:ascii="Courier New" w:hAnsi="Courier New" w:cs="Courier New"/>
+          <w:sz w:val="24"/>
+          <w:szCs w:val="24"/>
+        </w:rPr>
+        <w:t>EXTÉRIEUR</w:t>
+      </w:r>
+      <w:r>
+        <w:rPr>
+          <w:rFonts w:ascii="Courier New" w:hAnsi="Courier New" w:cs="Courier New"/>
+          <w:sz w:val="24"/>
+          <w:szCs w:val="24"/>
+        </w:rPr>
+        <w:t> </w:t>
+      </w:r>
+      <w:r>
+        <w:rPr>
+          <w:rFonts w:ascii="Courier New" w:hAnsi="Courier New" w:cs="Courier New"/>
+          <w:sz w:val="24"/>
+          <w:szCs w:val="24"/>
+        </w:rPr>
+        <w:t>:</w:t>
+      </w:r>
+      <w:r>
+        <w:rPr>
+          <w:rFonts w:ascii="Courier New" w:hAnsi="Courier New" w:cs="Courier New"/>
+          <w:sz w:val="24"/>
+          <w:szCs w:val="24"/>
+        </w:rPr>
+        <w:t xml:space="preserve"> rue Martine.</w:t>
+      </w:r>
+    </w:p>
+    <w:p>
+      <w:pPr>
+        <w:rPr>
+          <w:rFonts w:ascii="Courier New" w:hAnsi="Courier New" w:cs="Courier New"/>
+          <w:sz w:val="24"/>
+          <w:szCs w:val="24"/>
+        </w:rPr>
+      </w:pPr>
+      <w:r>
+        <w:rPr>
+          <w:noProof/>
+        </w:rPr>
+        <w:drawing>
+          <wp:inline distT="0" distB="0" distL="0" distR="0" wp14:anchorId="06D98011" wp14:editId="32E4AE20">
+            <wp:extent cx="2286000" cy="1285875"/>
+            <wp:effectExtent l="0" t="0" r="0" b="9525"/>
+            <wp:docPr id="7" name="Picture 7"/>
+            <wp:cNvGraphicFramePr>
+              <a:graphicFrameLocks xmlns:a="http://schemas.openxmlformats.org/drawingml/2006/main" noChangeAspect="1"/>
+            </wp:cNvGraphicFramePr>
+            <a:graphic xmlns:a="http://schemas.openxmlformats.org/drawingml/2006/main">
+              <a:graphicData uri="http://schemas.openxmlformats.org/drawingml/2006/picture">
+                <pic:pic xmlns:pic="http://schemas.openxmlformats.org/drawingml/2006/picture">
+                  <pic:nvPicPr>
+                    <pic:cNvPr id="0" name="Picture 1"/>
+                    <pic:cNvPicPr>
+                      <a:picLocks noChangeAspect="1" noChangeArrowheads="1"/>
+                    </pic:cNvPicPr>
+                  </pic:nvPicPr>
+                  <pic:blipFill>
+                    <a:blip r:embed="rId13" cstate="print">
+                      <a:extLst>
+                        <a:ext uri="{28A0092B-C50C-407E-A947-70E740481C1C}">
+                          <a14:useLocalDpi xmlns:a14="http://schemas.microsoft.com/office/drawing/2010/main" val="0"/>
+                        </a:ext>
+                      </a:extLst>
+                    </a:blip>
+                    <a:srcRect/>
+                    <a:stretch>
+                      <a:fillRect/>
+                    </a:stretch>
+                  </pic:blipFill>
+                  <pic:spPr bwMode="auto">
+                    <a:xfrm>
+                      <a:off x="0" y="0"/>
+                      <a:ext cx="2299620" cy="1293536"/>
+                    </a:xfrm>
+                    <a:prstGeom prst="rect">
+                      <a:avLst/>
+                    </a:prstGeom>
+                    <a:noFill/>
+                    <a:ln>
+                      <a:noFill/>
+                    </a:ln>
+                  </pic:spPr>
+                </pic:pic>
+              </a:graphicData>
+            </a:graphic>
+          </wp:inline>
+        </w:drawing>
+      </w:r>
+    </w:p>
+    <w:p>
+      <w:pPr>
+        <w:rPr>
+          <w:rFonts w:ascii="Courier New" w:hAnsi="Courier New" w:cs="Courier New"/>
+          <w:sz w:val="24"/>
+          <w:szCs w:val="24"/>
+        </w:rPr>
+      </w:pPr>
+      <w:r>
+        <w:rPr>
+          <w:rFonts w:ascii="Courier New" w:hAnsi="Courier New" w:cs="Courier New"/>
+          <w:sz w:val="24"/>
+          <w:szCs w:val="24"/>
+        </w:rPr>
+        <w:t xml:space="preserve">Blaise rencontre et </w:t>
+      </w:r>
+      <w:r>
+        <w:rPr>
+          <w:rFonts w:ascii="Courier New" w:hAnsi="Courier New" w:cs="Courier New"/>
+          <w:sz w:val="24"/>
+          <w:szCs w:val="24"/>
+        </w:rPr>
+        <w:t>interroge</w:t>
+      </w:r>
+      <w:r>
+        <w:rPr>
+          <w:rFonts w:ascii="Courier New" w:hAnsi="Courier New" w:cs="Courier New"/>
+          <w:sz w:val="24"/>
+          <w:szCs w:val="24"/>
+        </w:rPr>
+        <w:t xml:space="preserve"> Martine sur le meurtre de sa voisine. Elle dit avoir vu un homme sortir ce matin de chez elle</w:t>
+      </w:r>
+      <w:r>
+        <w:rPr>
+          <w:rFonts w:ascii="Courier New" w:hAnsi="Courier New" w:cs="Courier New"/>
+          <w:sz w:val="24"/>
+          <w:szCs w:val="24"/>
+        </w:rPr>
+        <w:t>…</w:t>
+      </w:r>
+    </w:p>
+    <w:p>
+      <w:pPr>
+        <w:rPr>
+          <w:rFonts w:ascii="Courier New" w:hAnsi="Courier New" w:cs="Courier New"/>
+          <w:sz w:val="24"/>
+          <w:szCs w:val="24"/>
+        </w:rPr>
+      </w:pPr>
+      <w:r>
+        <w:rPr>
+          <w:rFonts w:ascii="Courier New" w:hAnsi="Courier New" w:cs="Courier New"/>
+          <w:sz w:val="24"/>
+          <w:szCs w:val="24"/>
+        </w:rPr>
+        <w:t>MARTINE</w:t>
+      </w:r>
+    </w:p>
+    <w:p>
+      <w:pPr>
+        <w:rPr>
+          <w:rFonts w:ascii="Courier New" w:hAnsi="Courier New" w:cs="Courier New"/>
+          <w:sz w:val="24"/>
+          <w:szCs w:val="24"/>
+        </w:rPr>
+      </w:pPr>
+      <w:r>
+        <w:rPr>
+          <w:rFonts w:ascii="Courier New" w:hAnsi="Courier New" w:cs="Courier New"/>
+          <w:sz w:val="24"/>
+          <w:szCs w:val="24"/>
+        </w:rPr>
+        <w:t>Aaaah !</w:t>
+      </w:r>
+    </w:p>
+    <w:p>
+      <w:pPr>
+        <w:rPr>
+          <w:rFonts w:ascii="Courier New" w:hAnsi="Courier New" w:cs="Courier New"/>
+          <w:sz w:val="24"/>
+          <w:szCs w:val="24"/>
+        </w:rPr>
+      </w:pPr>
+      <w:r>
+        <w:rPr>
+          <w:rFonts w:ascii="Courier New" w:hAnsi="Courier New" w:cs="Courier New"/>
+          <w:sz w:val="24"/>
+          <w:szCs w:val="24"/>
+        </w:rPr>
+        <w:t>Qui êtes-vous ? Que voulez-vous ?</w:t>
       </w:r>
     </w:p>
     <w:sectPr>

</xml_diff>

<commit_message>
SCENE 1 & 2 FINIS
+nouvelle pièce (P_SANITAIRE)
+une fonction peut mtn être programmée à la fin d'une observation (une par boîte)
+un objet oRefletBlaise et un objet oMIroir
+quelques corrections sur le scripts
</commit_message>
<xml_diff>
--- a/SCRIPT_ENTRE CHIEN ET LOUP.docx
+++ b/SCRIPT_ENTRE CHIEN ET LOUP.docx
@@ -678,60 +678,7 @@
           <w:noProof/>
         </w:rPr>
         <w:drawing>
-          <wp:inline distT="0" distB="0" distL="0" distR="0" wp14:anchorId="1665B785" wp14:editId="58BD6902">
-            <wp:extent cx="1861764" cy="1240971"/>
-            <wp:effectExtent l="0" t="0" r="5715" b="0"/>
-            <wp:docPr id="4" name="Picture 4" descr="A picture containing sky, outdoor, sunset, clouds&#10;&#10;Description automatically generated"/>
-            <wp:cNvGraphicFramePr>
-              <a:graphicFrameLocks xmlns:a="http://schemas.openxmlformats.org/drawingml/2006/main" noChangeAspect="1"/>
-            </wp:cNvGraphicFramePr>
-            <a:graphic xmlns:a="http://schemas.openxmlformats.org/drawingml/2006/main">
-              <a:graphicData uri="http://schemas.openxmlformats.org/drawingml/2006/picture">
-                <pic:pic xmlns:pic="http://schemas.openxmlformats.org/drawingml/2006/picture">
-                  <pic:nvPicPr>
-                    <pic:cNvPr id="4" name="Picture 4" descr="A picture containing sky, outdoor, sunset, clouds&#10;&#10;Description automatically generated"/>
-                    <pic:cNvPicPr>
-                      <a:picLocks noChangeAspect="1" noChangeArrowheads="1"/>
-                    </pic:cNvPicPr>
-                  </pic:nvPicPr>
-                  <pic:blipFill>
-                    <a:blip r:embed="rId8" cstate="print">
-                      <a:extLst>
-                        <a:ext uri="{28A0092B-C50C-407E-A947-70E740481C1C}">
-                          <a14:useLocalDpi xmlns:a14="http://schemas.microsoft.com/office/drawing/2010/main" val="0"/>
-                        </a:ext>
-                      </a:extLst>
-                    </a:blip>
-                    <a:srcRect/>
-                    <a:stretch>
-                      <a:fillRect/>
-                    </a:stretch>
-                  </pic:blipFill>
-                  <pic:spPr bwMode="auto">
-                    <a:xfrm>
-                      <a:off x="0" y="0"/>
-                      <a:ext cx="1873145" cy="1248557"/>
-                    </a:xfrm>
-                    <a:prstGeom prst="rect">
-                      <a:avLst/>
-                    </a:prstGeom>
-                    <a:noFill/>
-                    <a:ln>
-                      <a:noFill/>
-                    </a:ln>
-                  </pic:spPr>
-                </pic:pic>
-              </a:graphicData>
-            </a:graphic>
-          </wp:inline>
-        </w:drawing>
-      </w:r>
-      <w:r>
-        <w:rPr>
-          <w:noProof/>
-        </w:rPr>
-        <w:drawing>
-          <wp:inline distT="0" distB="0" distL="0" distR="0" wp14:anchorId="4B7E18FA" wp14:editId="7F1D5B0E">
+          <wp:inline distT="0" distB="0" distL="0" distR="0" wp14:anchorId="4B7E18FA" wp14:editId="50FF9466">
             <wp:extent cx="1861185" cy="1240790"/>
             <wp:effectExtent l="0" t="0" r="5715" b="0"/>
             <wp:docPr id="5" name="Picture 5" descr="A picture containing text, outdoor, nature, clouds&#10;&#10;Description automatically generated"/>
@@ -748,7 +695,7 @@
                     </pic:cNvPicPr>
                   </pic:nvPicPr>
                   <pic:blipFill>
-                    <a:blip r:embed="rId9" cstate="print">
+                    <a:blip r:embed="rId8" cstate="print">
                       <a:extLst>
                         <a:ext uri="{28A0092B-C50C-407E-A947-70E740481C1C}">
                           <a14:useLocalDpi xmlns:a14="http://schemas.microsoft.com/office/drawing/2010/main" val="0"/>
@@ -801,7 +748,7 @@
                     </pic:cNvPicPr>
                   </pic:nvPicPr>
                   <pic:blipFill>
-                    <a:blip r:embed="rId10" cstate="print">
+                    <a:blip r:embed="rId9" cstate="print">
                       <a:extLst>
                         <a:ext uri="{28A0092B-C50C-407E-A947-70E740481C1C}">
                           <a14:useLocalDpi xmlns:a14="http://schemas.microsoft.com/office/drawing/2010/main" val="0"/>
@@ -1291,6 +1238,68 @@
     </w:p>
     <w:p>
       <w:pPr>
+        <w:rPr>
+          <w:rFonts w:ascii="Courier New" w:hAnsi="Courier New" w:cs="Courier New"/>
+          <w:sz w:val="24"/>
+          <w:szCs w:val="24"/>
+        </w:rPr>
+      </w:pPr>
+      <w:r>
+        <w:rPr>
+          <w:noProof/>
+        </w:rPr>
+        <w:drawing>
+          <wp:inline distT="0" distB="0" distL="0" distR="0" wp14:anchorId="6DF237E4" wp14:editId="53D30F12">
+            <wp:extent cx="2370124" cy="1777854"/>
+            <wp:effectExtent l="0" t="0" r="0" b="0"/>
+            <wp:docPr id="4" name="Image 4"/>
+            <wp:cNvGraphicFramePr>
+              <a:graphicFrameLocks xmlns:a="http://schemas.openxmlformats.org/drawingml/2006/main" noChangeAspect="1"/>
+            </wp:cNvGraphicFramePr>
+            <a:graphic xmlns:a="http://schemas.openxmlformats.org/drawingml/2006/main">
+              <a:graphicData uri="http://schemas.openxmlformats.org/drawingml/2006/picture">
+                <pic:pic xmlns:pic="http://schemas.openxmlformats.org/drawingml/2006/picture">
+                  <pic:nvPicPr>
+                    <pic:cNvPr id="0" name="Picture 1"/>
+                    <pic:cNvPicPr>
+                      <a:picLocks noChangeAspect="1" noChangeArrowheads="1"/>
+                    </pic:cNvPicPr>
+                  </pic:nvPicPr>
+                  <pic:blipFill>
+                    <a:blip r:embed="rId10" cstate="print">
+                      <a:extLst>
+                        <a:ext uri="{28A0092B-C50C-407E-A947-70E740481C1C}">
+                          <a14:useLocalDpi xmlns:a14="http://schemas.microsoft.com/office/drawing/2010/main" val="0"/>
+                        </a:ext>
+                      </a:extLst>
+                    </a:blip>
+                    <a:srcRect/>
+                    <a:stretch>
+                      <a:fillRect/>
+                    </a:stretch>
+                  </pic:blipFill>
+                  <pic:spPr bwMode="auto">
+                    <a:xfrm>
+                      <a:off x="0" y="0"/>
+                      <a:ext cx="2385395" cy="1789309"/>
+                    </a:xfrm>
+                    <a:prstGeom prst="rect">
+                      <a:avLst/>
+                    </a:prstGeom>
+                    <a:noFill/>
+                    <a:ln>
+                      <a:noFill/>
+                    </a:ln>
+                  </pic:spPr>
+                </pic:pic>
+              </a:graphicData>
+            </a:graphic>
+          </wp:inline>
+        </w:drawing>
+      </w:r>
+    </w:p>
+    <w:p>
+      <w:pPr>
         <w:jc w:val="both"/>
         <w:rPr>
           <w:rFonts w:ascii="Courier New" w:hAnsi="Courier New" w:cs="Courier New"/>
@@ -1566,6 +1575,14 @@
         </w:rPr>
         <w:t>Bientôt l’heure, reste pas là trop longtemps à parler seul tu vas ficher la trouille à tes très chers futurs collègues</w:t>
       </w:r>
+      <w:r>
+        <w:rPr>
+          <w:rFonts w:ascii="Courier New" w:hAnsi="Courier New" w:cs="Courier New"/>
+          <w:sz w:val="24"/>
+          <w:szCs w:val="24"/>
+        </w:rPr>
+        <w:t>.</w:t>
+      </w:r>
     </w:p>
     <w:p>
       <w:pPr>
@@ -1618,6 +1635,7 @@
           <w:sz w:val="24"/>
           <w:szCs w:val="24"/>
         </w:rPr>
+        <w:lastRenderedPageBreak/>
         <w:t>…</w:t>
       </w:r>
     </w:p>

</xml_diff>